<commit_message>
Add height to order prescription exports
</commit_message>
<xml_diff>
--- a/public/templates/regular-order.docx
+++ b/public/templates/regular-order.docx
@@ -1541,19 +1541,20 @@
         </w:tblCellMar>
       </w:tblPr>
       <w:tblGrid>
-        <w:gridCol w:w="1282"/>
-        <w:gridCol w:w="1282"/>
-        <w:gridCol w:w="1282"/>
-        <w:gridCol w:w="1282"/>
-        <w:gridCol w:w="1282"/>
-        <w:gridCol w:w="1282"/>
-        <w:gridCol w:w="1282"/>
+        <w:gridCol w:w="1122"/>
+        <w:gridCol w:w="1122"/>
+        <w:gridCol w:w="1122"/>
+        <w:gridCol w:w="1122"/>
+        <w:gridCol w:w="1122"/>
+        <w:gridCol w:w="1122"/>
+        <w:gridCol w:w="1122"/>
+        <w:gridCol w:w="1122"/>
         <w:gridCol w:w="1100"/>
       </w:tblGrid>
       <w:tr>
         <w:tc>
           <w:tcPr>
-            <w:tcW w:w="1282" w:type="dxa"/>
+            <w:tcW w:w="1122" w:type="dxa"/>
             <w:tcMar>
               <w:top w:w="40" w:type="dxa"/>
               <w:right w:w="120" w:type="dxa"/>
@@ -1578,13 +1579,13 @@
                 <w:bCs/>
                 <w:color w:val="52525B"/>
               </w:rPr>
-              <w:t xml:space="preserve">PD</w:t>
-            </w:r>
-          </w:p>
-        </w:tc>
-        <w:tc>
-          <w:tcPr>
-            <w:tcW w:w="1282" w:type="dxa"/>
+              <w:t xml:space="preserve">SPH</w:t>
+            </w:r>
+          </w:p>
+        </w:tc>
+        <w:tc>
+          <w:tcPr>
+            <w:tcW w:w="1122" w:type="dxa"/>
             <w:tcMar>
               <w:top w:w="40" w:type="dxa"/>
               <w:right w:w="120" w:type="dxa"/>
@@ -1609,13 +1610,13 @@
                 <w:bCs/>
                 <w:color w:val="52525B"/>
               </w:rPr>
-              <w:t xml:space="preserve">ADD</w:t>
-            </w:r>
-          </w:p>
-        </w:tc>
-        <w:tc>
-          <w:tcPr>
-            <w:tcW w:w="1282" w:type="dxa"/>
+              <w:t xml:space="preserve">CYL</w:t>
+            </w:r>
+          </w:p>
+        </w:tc>
+        <w:tc>
+          <w:tcPr>
+            <w:tcW w:w="1122" w:type="dxa"/>
             <w:tcMar>
               <w:top w:w="40" w:type="dxa"/>
               <w:right w:w="120" w:type="dxa"/>
@@ -1640,13 +1641,13 @@
                 <w:bCs/>
                 <w:color w:val="52525B"/>
               </w:rPr>
-              <w:t xml:space="preserve">BASE</w:t>
-            </w:r>
-          </w:p>
-        </w:tc>
-        <w:tc>
-          <w:tcPr>
-            <w:tcW w:w="1282" w:type="dxa"/>
+              <w:t xml:space="preserve">AX</w:t>
+            </w:r>
+          </w:p>
+        </w:tc>
+        <w:tc>
+          <w:tcPr>
+            <w:tcW w:w="1122" w:type="dxa"/>
             <w:tcMar>
               <w:top w:w="40" w:type="dxa"/>
               <w:right w:w="120" w:type="dxa"/>
@@ -1677,7 +1678,7 @@
         </w:tc>
         <w:tc>
           <w:tcPr>
-            <w:tcW w:w="1282" w:type="dxa"/>
+            <w:tcW w:w="1122" w:type="dxa"/>
             <w:tcMar>
               <w:top w:w="40" w:type="dxa"/>
               <w:right w:w="120" w:type="dxa"/>
@@ -1702,13 +1703,13 @@
                 <w:bCs/>
                 <w:color w:val="52525B"/>
               </w:rPr>
-              <w:t xml:space="preserve">AX</w:t>
-            </w:r>
-          </w:p>
-        </w:tc>
-        <w:tc>
-          <w:tcPr>
-            <w:tcW w:w="1282" w:type="dxa"/>
+              <w:t xml:space="preserve">BASE</w:t>
+            </w:r>
+          </w:p>
+        </w:tc>
+        <w:tc>
+          <w:tcPr>
+            <w:tcW w:w="1122" w:type="dxa"/>
             <w:tcMar>
               <w:top w:w="40" w:type="dxa"/>
               <w:right w:w="120" w:type="dxa"/>
@@ -1733,13 +1734,13 @@
                 <w:bCs/>
                 <w:color w:val="52525B"/>
               </w:rPr>
-              <w:t xml:space="preserve">CYL</w:t>
-            </w:r>
-          </w:p>
-        </w:tc>
-        <w:tc>
-          <w:tcPr>
-            <w:tcW w:w="1282" w:type="dxa"/>
+              <w:t xml:space="preserve">ADD</w:t>
+            </w:r>
+          </w:p>
+        </w:tc>
+        <w:tc>
+          <w:tcPr>
+            <w:tcW w:w="1122" w:type="dxa"/>
             <w:tcMar>
               <w:top w:w="40" w:type="dxa"/>
               <w:right w:w="120" w:type="dxa"/>
@@ -1764,7 +1765,38 @@
                 <w:bCs/>
                 <w:color w:val="52525B"/>
               </w:rPr>
-              <w:t xml:space="preserve">SPH</w:t>
+              <w:t xml:space="preserve">PD</w:t>
+            </w:r>
+          </w:p>
+        </w:tc>
+        <w:tc>
+          <w:tcPr>
+            <w:tcW w:w="1122" w:type="dxa"/>
+            <w:tcMar>
+              <w:top w:w="40" w:type="dxa"/>
+              <w:right w:w="120" w:type="dxa"/>
+              <w:bottom w:w="40" w:type="dxa"/>
+              <w:left w:w="120" w:type="dxa"/>
+            </w:tcMar>
+            <w:vAlign w:val="center"/>
+          </w:tcPr>
+          <w:p>
+            <w:pPr>
+              <w:jc w:val="center"/>
+              <w:bidi/>
+              <w:spacing w:before="0" w:after="0"/>
+            </w:pPr>
+            <w:r>
+              <w:rPr>
+                <w:rFonts w:ascii="Assistant" w:hAnsi="Assistant" w:cs="Assistant" w:eastAsia="Assistant"/>
+                <w:sz w:val="18"/>
+                <w:szCs w:val="18"/>
+                <w:rtl/>
+                <w:b/>
+                <w:bCs/>
+                <w:color w:val="52525B"/>
+              </w:rPr>
+              <w:t xml:space="preserve">גובה</w:t>
             </w:r>
           </w:p>
         </w:tc>
@@ -1803,7 +1835,7 @@
       <w:tr>
         <w:tc>
           <w:tcPr>
-            <w:tcW w:w="1282" w:type="dxa"/>
+            <w:tcW w:w="1122" w:type="dxa"/>
             <w:tcMar>
               <w:top w:w="40" w:type="dxa"/>
               <w:right w:w="120" w:type="dxa"/>
@@ -1825,13 +1857,181 @@
                 <w:szCs w:val="20"/>
                 <w:rtl/>
               </w:rPr>
+              <w:t>{r_sph}</w:t>
+            </w:r>
+          </w:p>
+        </w:tc>
+        <w:tc>
+          <w:tcPr>
+            <w:tcW w:w="1122" w:type="dxa"/>
+            <w:tcMar>
+              <w:top w:w="40" w:type="dxa"/>
+              <w:right w:w="120" w:type="dxa"/>
+              <w:bottom w:w="40" w:type="dxa"/>
+              <w:left w:w="120" w:type="dxa"/>
+            </w:tcMar>
+            <w:vAlign w:val="center"/>
+          </w:tcPr>
+          <w:p>
+            <w:pPr>
+              <w:jc w:val="center"/>
+              <w:bidi/>
+              <w:spacing w:before="0" w:after="0"/>
+            </w:pPr>
+            <w:r>
+              <w:rPr>
+                <w:rFonts w:ascii="Assistant" w:hAnsi="Assistant" w:cs="Assistant" w:eastAsia="Assistant"/>
+                <w:sz w:val="20"/>
+                <w:szCs w:val="20"/>
+                <w:rtl/>
+              </w:rPr>
+              <w:t>{r_cyl}</w:t>
+            </w:r>
+          </w:p>
+        </w:tc>
+        <w:tc>
+          <w:tcPr>
+            <w:tcW w:w="1122" w:type="dxa"/>
+            <w:tcMar>
+              <w:top w:w="40" w:type="dxa"/>
+              <w:right w:w="120" w:type="dxa"/>
+              <w:bottom w:w="40" w:type="dxa"/>
+              <w:left w:w="120" w:type="dxa"/>
+            </w:tcMar>
+            <w:vAlign w:val="center"/>
+          </w:tcPr>
+          <w:p>
+            <w:pPr>
+              <w:jc w:val="center"/>
+              <w:bidi/>
+              <w:spacing w:before="0" w:after="0"/>
+            </w:pPr>
+            <w:r>
+              <w:rPr>
+                <w:rFonts w:ascii="Assistant" w:hAnsi="Assistant" w:cs="Assistant" w:eastAsia="Assistant"/>
+                <w:sz w:val="20"/>
+                <w:szCs w:val="20"/>
+                <w:rtl/>
+              </w:rPr>
+              <w:t>{r_ax}</w:t>
+            </w:r>
+          </w:p>
+        </w:tc>
+        <w:tc>
+          <w:tcPr>
+            <w:tcW w:w="1122" w:type="dxa"/>
+            <w:tcMar>
+              <w:top w:w="40" w:type="dxa"/>
+              <w:right w:w="120" w:type="dxa"/>
+              <w:bottom w:w="40" w:type="dxa"/>
+              <w:left w:w="120" w:type="dxa"/>
+            </w:tcMar>
+            <w:vAlign w:val="center"/>
+          </w:tcPr>
+          <w:p>
+            <w:pPr>
+              <w:jc w:val="center"/>
+              <w:bidi/>
+              <w:spacing w:before="0" w:after="0"/>
+            </w:pPr>
+            <w:r>
+              <w:rPr>
+                <w:rFonts w:ascii="Assistant" w:hAnsi="Assistant" w:cs="Assistant" w:eastAsia="Assistant"/>
+                <w:sz w:val="20"/>
+                <w:szCs w:val="20"/>
+                <w:rtl/>
+              </w:rPr>
+              <w:t>{r_pris}</w:t>
+            </w:r>
+          </w:p>
+        </w:tc>
+        <w:tc>
+          <w:tcPr>
+            <w:tcW w:w="1122" w:type="dxa"/>
+            <w:tcMar>
+              <w:top w:w="40" w:type="dxa"/>
+              <w:right w:w="120" w:type="dxa"/>
+              <w:bottom w:w="40" w:type="dxa"/>
+              <w:left w:w="120" w:type="dxa"/>
+            </w:tcMar>
+            <w:vAlign w:val="center"/>
+          </w:tcPr>
+          <w:p>
+            <w:pPr>
+              <w:jc w:val="center"/>
+              <w:bidi/>
+              <w:spacing w:before="0" w:after="0"/>
+            </w:pPr>
+            <w:r>
+              <w:rPr>
+                <w:rFonts w:ascii="Assistant" w:hAnsi="Assistant" w:cs="Assistant" w:eastAsia="Assistant"/>
+                <w:sz w:val="20"/>
+                <w:szCs w:val="20"/>
+                <w:rtl/>
+              </w:rPr>
+              <w:t>{r_base}</w:t>
+            </w:r>
+          </w:p>
+        </w:tc>
+        <w:tc>
+          <w:tcPr>
+            <w:tcW w:w="1122" w:type="dxa"/>
+            <w:tcMar>
+              <w:top w:w="40" w:type="dxa"/>
+              <w:right w:w="120" w:type="dxa"/>
+              <w:bottom w:w="40" w:type="dxa"/>
+              <w:left w:w="120" w:type="dxa"/>
+            </w:tcMar>
+            <w:vAlign w:val="center"/>
+          </w:tcPr>
+          <w:p>
+            <w:pPr>
+              <w:jc w:val="center"/>
+              <w:bidi/>
+              <w:spacing w:before="0" w:after="0"/>
+            </w:pPr>
+            <w:r>
+              <w:rPr>
+                <w:rFonts w:ascii="Assistant" w:hAnsi="Assistant" w:cs="Assistant" w:eastAsia="Assistant"/>
+                <w:sz w:val="20"/>
+                <w:szCs w:val="20"/>
+                <w:rtl/>
+              </w:rPr>
+              <w:t>{r_add}</w:t>
+            </w:r>
+          </w:p>
+        </w:tc>
+        <w:tc>
+          <w:tcPr>
+            <w:tcW w:w="1122" w:type="dxa"/>
+            <w:tcMar>
+              <w:top w:w="40" w:type="dxa"/>
+              <w:right w:w="120" w:type="dxa"/>
+              <w:bottom w:w="40" w:type="dxa"/>
+              <w:left w:w="120" w:type="dxa"/>
+            </w:tcMar>
+            <w:vAlign w:val="center"/>
+          </w:tcPr>
+          <w:p>
+            <w:pPr>
+              <w:jc w:val="center"/>
+              <w:bidi/>
+              <w:spacing w:before="0" w:after="0"/>
+            </w:pPr>
+            <w:r>
+              <w:rPr>
+                <w:rFonts w:ascii="Assistant" w:hAnsi="Assistant" w:cs="Assistant" w:eastAsia="Assistant"/>
+                <w:sz w:val="20"/>
+                <w:szCs w:val="20"/>
+                <w:rtl/>
+              </w:rPr>
               <w:t>{r_pd}</w:t>
             </w:r>
           </w:p>
         </w:tc>
         <w:tc>
           <w:tcPr>
-            <w:tcW w:w="1282" w:type="dxa"/>
+            <w:tcW w:w="1122" w:type="dxa"/>
             <w:tcMar>
               <w:top w:w="40" w:type="dxa"/>
               <w:right w:w="120" w:type="dxa"/>
@@ -1853,147 +2053,7 @@
                 <w:szCs w:val="20"/>
                 <w:rtl/>
               </w:rPr>
-              <w:t>{r_add}</w:t>
-            </w:r>
-          </w:p>
-        </w:tc>
-        <w:tc>
-          <w:tcPr>
-            <w:tcW w:w="1282" w:type="dxa"/>
-            <w:tcMar>
-              <w:top w:w="40" w:type="dxa"/>
-              <w:right w:w="120" w:type="dxa"/>
-              <w:bottom w:w="40" w:type="dxa"/>
-              <w:left w:w="120" w:type="dxa"/>
-            </w:tcMar>
-            <w:vAlign w:val="center"/>
-          </w:tcPr>
-          <w:p>
-            <w:pPr>
-              <w:jc w:val="center"/>
-              <w:bidi/>
-              <w:spacing w:before="0" w:after="0"/>
-            </w:pPr>
-            <w:r>
-              <w:rPr>
-                <w:rFonts w:ascii="Assistant" w:hAnsi="Assistant" w:cs="Assistant" w:eastAsia="Assistant"/>
-                <w:sz w:val="20"/>
-                <w:szCs w:val="20"/>
-                <w:rtl/>
-              </w:rPr>
-              <w:t>{r_base}</w:t>
-            </w:r>
-          </w:p>
-        </w:tc>
-        <w:tc>
-          <w:tcPr>
-            <w:tcW w:w="1282" w:type="dxa"/>
-            <w:tcMar>
-              <w:top w:w="40" w:type="dxa"/>
-              <w:right w:w="120" w:type="dxa"/>
-              <w:bottom w:w="40" w:type="dxa"/>
-              <w:left w:w="120" w:type="dxa"/>
-            </w:tcMar>
-            <w:vAlign w:val="center"/>
-          </w:tcPr>
-          <w:p>
-            <w:pPr>
-              <w:jc w:val="center"/>
-              <w:bidi/>
-              <w:spacing w:before="0" w:after="0"/>
-            </w:pPr>
-            <w:r>
-              <w:rPr>
-                <w:rFonts w:ascii="Assistant" w:hAnsi="Assistant" w:cs="Assistant" w:eastAsia="Assistant"/>
-                <w:sz w:val="20"/>
-                <w:szCs w:val="20"/>
-                <w:rtl/>
-              </w:rPr>
-              <w:t>{r_pris}</w:t>
-            </w:r>
-          </w:p>
-        </w:tc>
-        <w:tc>
-          <w:tcPr>
-            <w:tcW w:w="1282" w:type="dxa"/>
-            <w:tcMar>
-              <w:top w:w="40" w:type="dxa"/>
-              <w:right w:w="120" w:type="dxa"/>
-              <w:bottom w:w="40" w:type="dxa"/>
-              <w:left w:w="120" w:type="dxa"/>
-            </w:tcMar>
-            <w:vAlign w:val="center"/>
-          </w:tcPr>
-          <w:p>
-            <w:pPr>
-              <w:jc w:val="center"/>
-              <w:bidi/>
-              <w:spacing w:before="0" w:after="0"/>
-            </w:pPr>
-            <w:r>
-              <w:rPr>
-                <w:rFonts w:ascii="Assistant" w:hAnsi="Assistant" w:cs="Assistant" w:eastAsia="Assistant"/>
-                <w:sz w:val="20"/>
-                <w:szCs w:val="20"/>
-                <w:rtl/>
-              </w:rPr>
-              <w:t>{r_ax}</w:t>
-            </w:r>
-          </w:p>
-        </w:tc>
-        <w:tc>
-          <w:tcPr>
-            <w:tcW w:w="1282" w:type="dxa"/>
-            <w:tcMar>
-              <w:top w:w="40" w:type="dxa"/>
-              <w:right w:w="120" w:type="dxa"/>
-              <w:bottom w:w="40" w:type="dxa"/>
-              <w:left w:w="120" w:type="dxa"/>
-            </w:tcMar>
-            <w:vAlign w:val="center"/>
-          </w:tcPr>
-          <w:p>
-            <w:pPr>
-              <w:jc w:val="center"/>
-              <w:bidi/>
-              <w:spacing w:before="0" w:after="0"/>
-            </w:pPr>
-            <w:r>
-              <w:rPr>
-                <w:rFonts w:ascii="Assistant" w:hAnsi="Assistant" w:cs="Assistant" w:eastAsia="Assistant"/>
-                <w:sz w:val="20"/>
-                <w:szCs w:val="20"/>
-                <w:rtl/>
-              </w:rPr>
-              <w:t>{r_cyl}</w:t>
-            </w:r>
-          </w:p>
-        </w:tc>
-        <w:tc>
-          <w:tcPr>
-            <w:tcW w:w="1282" w:type="dxa"/>
-            <w:tcMar>
-              <w:top w:w="40" w:type="dxa"/>
-              <w:right w:w="120" w:type="dxa"/>
-              <w:bottom w:w="40" w:type="dxa"/>
-              <w:left w:w="120" w:type="dxa"/>
-            </w:tcMar>
-            <w:vAlign w:val="center"/>
-          </w:tcPr>
-          <w:p>
-            <w:pPr>
-              <w:jc w:val="center"/>
-              <w:bidi/>
-              <w:spacing w:before="0" w:after="0"/>
-            </w:pPr>
-            <w:r>
-              <w:rPr>
-                <w:rFonts w:ascii="Assistant" w:hAnsi="Assistant" w:cs="Assistant" w:eastAsia="Assistant"/>
-                <w:sz w:val="20"/>
-                <w:szCs w:val="20"/>
-                <w:rtl/>
-              </w:rPr>
-              <w:t>{r_sph}</w:t>
+              <w:t>{r_high}</w:t>
             </w:r>
           </w:p>
         </w:tc>
@@ -2031,7 +2091,7 @@
       <w:tr>
         <w:tc>
           <w:tcPr>
-            <w:tcW w:w="1282" w:type="dxa"/>
+            <w:tcW w:w="1122" w:type="dxa"/>
             <w:tcMar>
               <w:top w:w="40" w:type="dxa"/>
               <w:right w:w="120" w:type="dxa"/>
@@ -2053,13 +2113,181 @@
                 <w:szCs w:val="20"/>
                 <w:rtl/>
               </w:rPr>
+              <w:t>{l_sph}</w:t>
+            </w:r>
+          </w:p>
+        </w:tc>
+        <w:tc>
+          <w:tcPr>
+            <w:tcW w:w="1122" w:type="dxa"/>
+            <w:tcMar>
+              <w:top w:w="40" w:type="dxa"/>
+              <w:right w:w="120" w:type="dxa"/>
+              <w:bottom w:w="40" w:type="dxa"/>
+              <w:left w:w="120" w:type="dxa"/>
+            </w:tcMar>
+            <w:vAlign w:val="center"/>
+          </w:tcPr>
+          <w:p>
+            <w:pPr>
+              <w:jc w:val="center"/>
+              <w:bidi/>
+              <w:spacing w:before="0" w:after="0"/>
+            </w:pPr>
+            <w:r>
+              <w:rPr>
+                <w:rFonts w:ascii="Assistant" w:hAnsi="Assistant" w:cs="Assistant" w:eastAsia="Assistant"/>
+                <w:sz w:val="20"/>
+                <w:szCs w:val="20"/>
+                <w:rtl/>
+              </w:rPr>
+              <w:t>{l_cyl}</w:t>
+            </w:r>
+          </w:p>
+        </w:tc>
+        <w:tc>
+          <w:tcPr>
+            <w:tcW w:w="1122" w:type="dxa"/>
+            <w:tcMar>
+              <w:top w:w="40" w:type="dxa"/>
+              <w:right w:w="120" w:type="dxa"/>
+              <w:bottom w:w="40" w:type="dxa"/>
+              <w:left w:w="120" w:type="dxa"/>
+            </w:tcMar>
+            <w:vAlign w:val="center"/>
+          </w:tcPr>
+          <w:p>
+            <w:pPr>
+              <w:jc w:val="center"/>
+              <w:bidi/>
+              <w:spacing w:before="0" w:after="0"/>
+            </w:pPr>
+            <w:r>
+              <w:rPr>
+                <w:rFonts w:ascii="Assistant" w:hAnsi="Assistant" w:cs="Assistant" w:eastAsia="Assistant"/>
+                <w:sz w:val="20"/>
+                <w:szCs w:val="20"/>
+                <w:rtl/>
+              </w:rPr>
+              <w:t>{l_ax}</w:t>
+            </w:r>
+          </w:p>
+        </w:tc>
+        <w:tc>
+          <w:tcPr>
+            <w:tcW w:w="1122" w:type="dxa"/>
+            <w:tcMar>
+              <w:top w:w="40" w:type="dxa"/>
+              <w:right w:w="120" w:type="dxa"/>
+              <w:bottom w:w="40" w:type="dxa"/>
+              <w:left w:w="120" w:type="dxa"/>
+            </w:tcMar>
+            <w:vAlign w:val="center"/>
+          </w:tcPr>
+          <w:p>
+            <w:pPr>
+              <w:jc w:val="center"/>
+              <w:bidi/>
+              <w:spacing w:before="0" w:after="0"/>
+            </w:pPr>
+            <w:r>
+              <w:rPr>
+                <w:rFonts w:ascii="Assistant" w:hAnsi="Assistant" w:cs="Assistant" w:eastAsia="Assistant"/>
+                <w:sz w:val="20"/>
+                <w:szCs w:val="20"/>
+                <w:rtl/>
+              </w:rPr>
+              <w:t>{l_pris}</w:t>
+            </w:r>
+          </w:p>
+        </w:tc>
+        <w:tc>
+          <w:tcPr>
+            <w:tcW w:w="1122" w:type="dxa"/>
+            <w:tcMar>
+              <w:top w:w="40" w:type="dxa"/>
+              <w:right w:w="120" w:type="dxa"/>
+              <w:bottom w:w="40" w:type="dxa"/>
+              <w:left w:w="120" w:type="dxa"/>
+            </w:tcMar>
+            <w:vAlign w:val="center"/>
+          </w:tcPr>
+          <w:p>
+            <w:pPr>
+              <w:jc w:val="center"/>
+              <w:bidi/>
+              <w:spacing w:before="0" w:after="0"/>
+            </w:pPr>
+            <w:r>
+              <w:rPr>
+                <w:rFonts w:ascii="Assistant" w:hAnsi="Assistant" w:cs="Assistant" w:eastAsia="Assistant"/>
+                <w:sz w:val="20"/>
+                <w:szCs w:val="20"/>
+                <w:rtl/>
+              </w:rPr>
+              <w:t>{l_base}</w:t>
+            </w:r>
+          </w:p>
+        </w:tc>
+        <w:tc>
+          <w:tcPr>
+            <w:tcW w:w="1122" w:type="dxa"/>
+            <w:tcMar>
+              <w:top w:w="40" w:type="dxa"/>
+              <w:right w:w="120" w:type="dxa"/>
+              <w:bottom w:w="40" w:type="dxa"/>
+              <w:left w:w="120" w:type="dxa"/>
+            </w:tcMar>
+            <w:vAlign w:val="center"/>
+          </w:tcPr>
+          <w:p>
+            <w:pPr>
+              <w:jc w:val="center"/>
+              <w:bidi/>
+              <w:spacing w:before="0" w:after="0"/>
+            </w:pPr>
+            <w:r>
+              <w:rPr>
+                <w:rFonts w:ascii="Assistant" w:hAnsi="Assistant" w:cs="Assistant" w:eastAsia="Assistant"/>
+                <w:sz w:val="20"/>
+                <w:szCs w:val="20"/>
+                <w:rtl/>
+              </w:rPr>
+              <w:t>{l_add}</w:t>
+            </w:r>
+          </w:p>
+        </w:tc>
+        <w:tc>
+          <w:tcPr>
+            <w:tcW w:w="1122" w:type="dxa"/>
+            <w:tcMar>
+              <w:top w:w="40" w:type="dxa"/>
+              <w:right w:w="120" w:type="dxa"/>
+              <w:bottom w:w="40" w:type="dxa"/>
+              <w:left w:w="120" w:type="dxa"/>
+            </w:tcMar>
+            <w:vAlign w:val="center"/>
+          </w:tcPr>
+          <w:p>
+            <w:pPr>
+              <w:jc w:val="center"/>
+              <w:bidi/>
+              <w:spacing w:before="0" w:after="0"/>
+            </w:pPr>
+            <w:r>
+              <w:rPr>
+                <w:rFonts w:ascii="Assistant" w:hAnsi="Assistant" w:cs="Assistant" w:eastAsia="Assistant"/>
+                <w:sz w:val="20"/>
+                <w:szCs w:val="20"/>
+                <w:rtl/>
+              </w:rPr>
               <w:t>{l_pd}</w:t>
             </w:r>
           </w:p>
         </w:tc>
         <w:tc>
           <w:tcPr>
-            <w:tcW w:w="1282" w:type="dxa"/>
+            <w:tcW w:w="1122" w:type="dxa"/>
             <w:tcMar>
               <w:top w:w="40" w:type="dxa"/>
               <w:right w:w="120" w:type="dxa"/>
@@ -2081,147 +2309,7 @@
                 <w:szCs w:val="20"/>
                 <w:rtl/>
               </w:rPr>
-              <w:t>{l_add}</w:t>
-            </w:r>
-          </w:p>
-        </w:tc>
-        <w:tc>
-          <w:tcPr>
-            <w:tcW w:w="1282" w:type="dxa"/>
-            <w:tcMar>
-              <w:top w:w="40" w:type="dxa"/>
-              <w:right w:w="120" w:type="dxa"/>
-              <w:bottom w:w="40" w:type="dxa"/>
-              <w:left w:w="120" w:type="dxa"/>
-            </w:tcMar>
-            <w:vAlign w:val="center"/>
-          </w:tcPr>
-          <w:p>
-            <w:pPr>
-              <w:jc w:val="center"/>
-              <w:bidi/>
-              <w:spacing w:before="0" w:after="0"/>
-            </w:pPr>
-            <w:r>
-              <w:rPr>
-                <w:rFonts w:ascii="Assistant" w:hAnsi="Assistant" w:cs="Assistant" w:eastAsia="Assistant"/>
-                <w:sz w:val="20"/>
-                <w:szCs w:val="20"/>
-                <w:rtl/>
-              </w:rPr>
-              <w:t>{l_base}</w:t>
-            </w:r>
-          </w:p>
-        </w:tc>
-        <w:tc>
-          <w:tcPr>
-            <w:tcW w:w="1282" w:type="dxa"/>
-            <w:tcMar>
-              <w:top w:w="40" w:type="dxa"/>
-              <w:right w:w="120" w:type="dxa"/>
-              <w:bottom w:w="40" w:type="dxa"/>
-              <w:left w:w="120" w:type="dxa"/>
-            </w:tcMar>
-            <w:vAlign w:val="center"/>
-          </w:tcPr>
-          <w:p>
-            <w:pPr>
-              <w:jc w:val="center"/>
-              <w:bidi/>
-              <w:spacing w:before="0" w:after="0"/>
-            </w:pPr>
-            <w:r>
-              <w:rPr>
-                <w:rFonts w:ascii="Assistant" w:hAnsi="Assistant" w:cs="Assistant" w:eastAsia="Assistant"/>
-                <w:sz w:val="20"/>
-                <w:szCs w:val="20"/>
-                <w:rtl/>
-              </w:rPr>
-              <w:t>{l_pris}</w:t>
-            </w:r>
-          </w:p>
-        </w:tc>
-        <w:tc>
-          <w:tcPr>
-            <w:tcW w:w="1282" w:type="dxa"/>
-            <w:tcMar>
-              <w:top w:w="40" w:type="dxa"/>
-              <w:right w:w="120" w:type="dxa"/>
-              <w:bottom w:w="40" w:type="dxa"/>
-              <w:left w:w="120" w:type="dxa"/>
-            </w:tcMar>
-            <w:vAlign w:val="center"/>
-          </w:tcPr>
-          <w:p>
-            <w:pPr>
-              <w:jc w:val="center"/>
-              <w:bidi/>
-              <w:spacing w:before="0" w:after="0"/>
-            </w:pPr>
-            <w:r>
-              <w:rPr>
-                <w:rFonts w:ascii="Assistant" w:hAnsi="Assistant" w:cs="Assistant" w:eastAsia="Assistant"/>
-                <w:sz w:val="20"/>
-                <w:szCs w:val="20"/>
-                <w:rtl/>
-              </w:rPr>
-              <w:t>{l_ax}</w:t>
-            </w:r>
-          </w:p>
-        </w:tc>
-        <w:tc>
-          <w:tcPr>
-            <w:tcW w:w="1282" w:type="dxa"/>
-            <w:tcMar>
-              <w:top w:w="40" w:type="dxa"/>
-              <w:right w:w="120" w:type="dxa"/>
-              <w:bottom w:w="40" w:type="dxa"/>
-              <w:left w:w="120" w:type="dxa"/>
-            </w:tcMar>
-            <w:vAlign w:val="center"/>
-          </w:tcPr>
-          <w:p>
-            <w:pPr>
-              <w:jc w:val="center"/>
-              <w:bidi/>
-              <w:spacing w:before="0" w:after="0"/>
-            </w:pPr>
-            <w:r>
-              <w:rPr>
-                <w:rFonts w:ascii="Assistant" w:hAnsi="Assistant" w:cs="Assistant" w:eastAsia="Assistant"/>
-                <w:sz w:val="20"/>
-                <w:szCs w:val="20"/>
-                <w:rtl/>
-              </w:rPr>
-              <w:t>{l_cyl}</w:t>
-            </w:r>
-          </w:p>
-        </w:tc>
-        <w:tc>
-          <w:tcPr>
-            <w:tcW w:w="1282" w:type="dxa"/>
-            <w:tcMar>
-              <w:top w:w="40" w:type="dxa"/>
-              <w:right w:w="120" w:type="dxa"/>
-              <w:bottom w:w="40" w:type="dxa"/>
-              <w:left w:w="120" w:type="dxa"/>
-            </w:tcMar>
-            <w:vAlign w:val="center"/>
-          </w:tcPr>
-          <w:p>
-            <w:pPr>
-              <w:jc w:val="center"/>
-              <w:bidi/>
-              <w:spacing w:before="0" w:after="0"/>
-            </w:pPr>
-            <w:r>
-              <w:rPr>
-                <w:rFonts w:ascii="Assistant" w:hAnsi="Assistant" w:cs="Assistant" w:eastAsia="Assistant"/>
-                <w:sz w:val="20"/>
-                <w:szCs w:val="20"/>
-                <w:rtl/>
-              </w:rPr>
-              <w:t>{l_sph}</w:t>
+              <w:t>{l_high}</w:t>
             </w:r>
           </w:p>
         </w:tc>

</xml_diff>